<commit_message>
chore(LVA-081): close as Completed with real build-verify evidence
Evidence file records the actual fetch/behind-count results and the
real command output from each per-bump build-verify step (see
.lava-ci-evidence/bluff-hunt/2026-08-12-lva-081-submodule-bump-evidence.md).
Regenerated docs/Issues.md + docs/Fixed.md + summaries + html/pdf/docx
exports from the DB.

Classification: project-specific
</commit_message>
<xml_diff>
--- a/docs/Fixed.docx
+++ b/docs/Fixed.docx
@@ -7567,6 +7567,122 @@
       </w:r>
     </w:p>
     <w:bookmarkEnd w:id="89"/>
+    <w:bookmarkStart w:id="90" w:name="Xe4759afa899ae59a232e0949e9e65918cc454e6"/>
+    <w:p>
+      <w:pPr>
+        <w:pStyle w:val="Heading2"/>
+      </w:pPr>
+      <w:r>
+        <w:t xml:space="preserve">LVA-081 — Fetch/pull/merge latest from all submodules + build-verify (operator directive 2026-06-26)</w:t>
+      </w:r>
+    </w:p>
+    <w:p>
+      <w:pPr>
+        <w:pStyle w:val="FirstParagraph"/>
+      </w:pPr>
+      <w:r>
+        <w:rPr>
+          <w:b/>
+          <w:bCs/>
+        </w:rPr>
+        <w:t xml:space="preserve">Status:</w:t>
+      </w:r>
+      <w:r>
+        <w:t xml:space="preserve"> </w:t>
+      </w:r>
+      <w:r>
+        <w:t xml:space="preserve">Completed (→ Fixed.md)</w:t>
+      </w:r>
+      <w:r>
+        <w:t xml:space="preserve"> </w:t>
+      </w:r>
+      <w:r>
+        <w:rPr>
+          <w:b/>
+          <w:bCs/>
+        </w:rPr>
+        <w:t xml:space="preserve">Type:</w:t>
+      </w:r>
+      <w:r>
+        <w:t xml:space="preserve"> </w:t>
+      </w:r>
+      <w:r>
+        <w:t xml:space="preserve">Task</w:t>
+      </w:r>
+      <w:r>
+        <w:t xml:space="preserve"> </w:t>
+      </w:r>
+      <w:r>
+        <w:rPr>
+          <w:b/>
+          <w:bCs/>
+        </w:rPr>
+        <w:t xml:space="preserve">Evidence:</w:t>
+      </w:r>
+      <w:r>
+        <w:t xml:space="preserve"> </w:t>
+      </w:r>
+      <w:r>
+        <w:t xml:space="preserve">.lava-ci-evidence/bluff-hunt/2026-08-12-lva-081-submodule-bump-evidence.md</w:t>
+      </w:r>
+      <w:r>
+        <w:t xml:space="preserve"> </w:t>
+      </w:r>
+      <w:r>
+        <w:rPr>
+          <w:b/>
+          <w:bCs/>
+        </w:rPr>
+        <w:t xml:space="preserve">Severity:</w:t>
+      </w:r>
+      <w:r>
+        <w:t xml:space="preserve"> </w:t>
+      </w:r>
+      <w:r>
+        <w:t xml:space="preserve">P2</w:t>
+      </w:r>
+      <w:r>
+        <w:t xml:space="preserve"> </w:t>
+      </w:r>
+      <w:r>
+        <w:rPr>
+          <w:b/>
+          <w:bCs/>
+        </w:rPr>
+        <w:t xml:space="preserve">Created-By:</w:t>
+      </w:r>
+      <w:r>
+        <w:t xml:space="preserve"> </w:t>
+      </w:r>
+      <w:r>
+        <w:t xml:space="preserve">AI</w:t>
+      </w:r>
+      <w:r>
+        <w:t xml:space="preserve"> </w:t>
+      </w:r>
+      <w:r>
+        <w:rPr>
+          <w:b/>
+          <w:bCs/>
+        </w:rPr>
+        <w:t xml:space="preserve">Assigned-To:</w:t>
+      </w:r>
+      <w:r>
+        <w:t xml:space="preserve"> </w:t>
+      </w:r>
+      <w:r>
+        <w:t xml:space="preserve">AI</w:t>
+      </w:r>
+    </w:p>
+    <w:p>
+      <w:pPr>
+        <w:pStyle w:val="BodyText"/>
+      </w:pPr>
+      <w:r>
+        <w:t xml:space="preserve">Operator directive: fetch+pull+merge latest codebase from all submodules. Frozen-by-default overridden for this cycle. Must build-verify after each bump; revert+report any submodule whose bump breaks the build.</w:t>
+      </w:r>
+    </w:p>
+    <w:bookmarkEnd w:id="90"/>
     <w:sectPr>
       <w:footnotePr>
         <w:numRestart w:val="eachSect"/>

</xml_diff>

<commit_message>
fix(workable-items): regenerate Issues_Summary/Fixed_Summary — were left stale by prior commit
The prior commit (c2437f35) closed LVA-095/LVA-082 via `sync db-to-md`, which
only regenerates Issues.md/Fixed.md, not the Summary docs. Issues_Summary.md
and Fixed_Summary.md still showed both items as Queued. Regenerated via the
canonical binary's `export` subcommand, which covers all tracker outputs.
</commit_message>
<xml_diff>
--- a/docs/Fixed.docx
+++ b/docs/Fixed.docx
@@ -8167,6 +8167,218 @@
       </w:r>
     </w:p>
     <w:bookmarkEnd w:id="94"/>
+    <w:bookmarkStart w:id="95" w:name="X5273f6652ca37641b9b173b12ead9be64e724ee"/>
+    <w:p>
+      <w:pPr>
+        <w:pStyle w:val="Heading2"/>
+      </w:pPr>
+      <w:r>
+        <w:t xml:space="preserve">LVA-095 — on-device API keyless mDNS endpoint does not read/persist local api-app key</w:t>
+      </w:r>
+    </w:p>
+    <w:p>
+      <w:pPr>
+        <w:pStyle w:val="FirstParagraph"/>
+      </w:pPr>
+      <w:r>
+        <w:rPr>
+          <w:b/>
+          <w:bCs/>
+        </w:rPr>
+        <w:t xml:space="preserve">Status:</w:t>
+      </w:r>
+      <w:r>
+        <w:t xml:space="preserve"> </w:t>
+      </w:r>
+      <w:r>
+        <w:t xml:space="preserve">Fixed (→ Fixed.md)</w:t>
+      </w:r>
+      <w:r>
+        <w:t xml:space="preserve"> </w:t>
+      </w:r>
+      <w:r>
+        <w:rPr>
+          <w:b/>
+          <w:bCs/>
+        </w:rPr>
+        <w:t xml:space="preserve">Type:</w:t>
+      </w:r>
+      <w:r>
+        <w:t xml:space="preserve"> </w:t>
+      </w:r>
+      <w:r>
+        <w:t xml:space="preserve">Bug</w:t>
+      </w:r>
+      <w:r>
+        <w:t xml:space="preserve"> </w:t>
+      </w:r>
+      <w:r>
+        <w:rPr>
+          <w:b/>
+          <w:bCs/>
+        </w:rPr>
+        <w:t xml:space="preserve">Evidence:</w:t>
+      </w:r>
+      <w:r>
+        <w:t xml:space="preserve"> </w:t>
+      </w:r>
+      <w:r>
+        <w:t xml:space="preserve">.lava-ci-evidence/workable-items-closures/2026-08-20-lva-095-lva-082-closure.md</w:t>
+      </w:r>
+      <w:r>
+        <w:t xml:space="preserve"> </w:t>
+      </w:r>
+      <w:r>
+        <w:rPr>
+          <w:b/>
+          <w:bCs/>
+        </w:rPr>
+        <w:t xml:space="preserve">Severity:</w:t>
+      </w:r>
+      <w:r>
+        <w:t xml:space="preserve"> </w:t>
+      </w:r>
+      <w:r>
+        <w:t xml:space="preserve">P1</w:t>
+      </w:r>
+      <w:r>
+        <w:t xml:space="preserve"> </w:t>
+      </w:r>
+      <w:r>
+        <w:rPr>
+          <w:b/>
+          <w:bCs/>
+        </w:rPr>
+        <w:t xml:space="preserve">Created-By:</w:t>
+      </w:r>
+      <w:r>
+        <w:t xml:space="preserve"> </w:t>
+      </w:r>
+      <w:r>
+        <w:t xml:space="preserve">AI</w:t>
+      </w:r>
+    </w:p>
+    <w:p>
+      <w:pPr>
+        <w:pStyle w:val="BodyText"/>
+      </w:pPr>
+      <w:r>
+        <w:t xml:space="preserve">OnboardingViewModelDynamicProvidersTest &gt;</w:t>
+      </w:r>
+      <w:r>
+        <w:t xml:space="preserve"> </w:t>
+      </w:r>
+      <w:r>
+        <w:t xml:space="preserve">‘selecting a keyless on-device API reads and persists the local api key for search auth’</w:t>
+      </w:r>
+      <w:r>
+        <w:t xml:space="preserve"> </w:t>
+      </w:r>
+      <w:r>
+        <w:t xml:space="preserve">FAILS: AssertionError - the local api-app key MUST be read + persisted onto the keyless mDNS-selected endpoint (was GoApi(host=localhost.localdomain, port=42873, platform=null, storage=null, key=null)). Discovered 2026-08-12 while running the combined test suite after merging 4 parallel LVA-085/086/087/093/094 fixes - confirmed genuinely pre-existing and unrelated to any of those 4 changes (git log shows the test file’s last touch was commit b3cb6de2, predating this session; none of the 4 merged branches touch onboarding/api-key/mDNS code per git diff –name-only). Not yet root-caused - source: real gradle test run, feature/onboarding/build/test-results/testDebugUnitTest/.</w:t>
+      </w:r>
+    </w:p>
+    <w:bookmarkEnd w:id="95"/>
+    <w:bookmarkStart w:id="96" w:name="X38fba68ce77e907e542fa3febcf25a83b8aaf3d"/>
+    <w:p>
+      <w:pPr>
+        <w:pStyle w:val="Heading2"/>
+      </w:pPr>
+      <w:r>
+        <w:t xml:space="preserve">LVA-082 — Crashlytics read NOT available via Firebase CLI — only symbols/mappingfile upload; no issues:list; bq absent</w:t>
+      </w:r>
+    </w:p>
+    <w:p>
+      <w:pPr>
+        <w:pStyle w:val="FirstParagraph"/>
+      </w:pPr>
+      <w:r>
+        <w:rPr>
+          <w:b/>
+          <w:bCs/>
+        </w:rPr>
+        <w:t xml:space="preserve">Status:</w:t>
+      </w:r>
+      <w:r>
+        <w:t xml:space="preserve"> </w:t>
+      </w:r>
+      <w:r>
+        <w:t xml:space="preserve">Completed (→ Fixed.md)</w:t>
+      </w:r>
+      <w:r>
+        <w:t xml:space="preserve"> </w:t>
+      </w:r>
+      <w:r>
+        <w:rPr>
+          <w:b/>
+          <w:bCs/>
+        </w:rPr>
+        <w:t xml:space="preserve">Type:</w:t>
+      </w:r>
+      <w:r>
+        <w:t xml:space="preserve"> </w:t>
+      </w:r>
+      <w:r>
+        <w:t xml:space="preserve">Task</w:t>
+      </w:r>
+      <w:r>
+        <w:t xml:space="preserve"> </w:t>
+      </w:r>
+      <w:r>
+        <w:rPr>
+          <w:b/>
+          <w:bCs/>
+        </w:rPr>
+        <w:t xml:space="preserve">Evidence:</w:t>
+      </w:r>
+      <w:r>
+        <w:t xml:space="preserve"> </w:t>
+      </w:r>
+      <w:r>
+        <w:t xml:space="preserve">.lava-ci-evidence/workable-items-closures/2026-08-20-lva-095-lva-082-closure.md</w:t>
+      </w:r>
+      <w:r>
+        <w:t xml:space="preserve"> </w:t>
+      </w:r>
+      <w:r>
+        <w:rPr>
+          <w:b/>
+          <w:bCs/>
+        </w:rPr>
+        <w:t xml:space="preserve">Severity:</w:t>
+      </w:r>
+      <w:r>
+        <w:t xml:space="preserve"> </w:t>
+      </w:r>
+      <w:r>
+        <w:t xml:space="preserve">P3</w:t>
+      </w:r>
+      <w:r>
+        <w:t xml:space="preserve"> </w:t>
+      </w:r>
+      <w:r>
+        <w:rPr>
+          <w:b/>
+          <w:bCs/>
+        </w:rPr>
+        <w:t xml:space="preserve">Created-By:</w:t>
+      </w:r>
+      <w:r>
+        <w:t xml:space="preserve"> </w:t>
+      </w:r>
+      <w:r>
+        <w:t xml:space="preserve">AI</w:t>
+      </w:r>
+    </w:p>
+    <w:p>
+      <w:pPr>
+        <w:pStyle w:val="BodyText"/>
+      </w:pPr>
+      <w:r>
+        <w:t xml:space="preserve">Operator asked to use Firebase CLI to pull Crashlytics. Verified Firebase CLI 14.17.0 exposes only crashlytics:symbols:upload + mappingfile:* (NO issue/non-fatal read). bq CLI absent. Crashlytics dashboard read requires console or a BigQuery export not configured. Fallback: in-repo §6.AC telemetry + known crash tickets; operator to paste console items for full triage. §11.4.6 honest record.</w:t>
+      </w:r>
+    </w:p>
+    <w:bookmarkEnd w:id="96"/>
     <w:sectPr>
       <w:footnotePr>
         <w:numRestart w:val="eachSect"/>

</xml_diff>